<commit_message>
Completed Flavors in Flutter
</commit_message>
<xml_diff>
--- a/flutter_more_documents/f27_flutter_mobile_security_info.docx
+++ b/flutter_more_documents/f27_flutter_mobile_security_info.docx
@@ -10555,6 +10555,15 @@
           <w:szCs w:val="32"/>
         </w:rPr>
       </w:pPr>
+    </w:p>
+    <w:p>
+      <w:pPr>
+        <w:jc w:val="both"/>
+        <w:rPr>
+          <w:sz w:val="32"/>
+          <w:szCs w:val="32"/>
+        </w:rPr>
+      </w:pPr>
       <w:r>
         <w:rPr>
           <w:sz w:val="32"/>
@@ -10677,6 +10686,158 @@
         </w:rPr>
         <w:t>('API_URL');</w:t>
       </w:r>
+    </w:p>
+    <w:p>
+      <w:pPr>
+        <w:jc w:val="both"/>
+        <w:rPr>
+          <w:sz w:val="32"/>
+          <w:szCs w:val="32"/>
+        </w:rPr>
+      </w:pPr>
+      <w:r>
+        <w:rPr>
+          <w:b/>
+          <w:bCs/>
+          <w:sz w:val="32"/>
+          <w:szCs w:val="32"/>
+        </w:rPr>
+        <w:t>NOTE:</w:t>
+      </w:r>
+      <w:r>
+        <w:rPr>
+          <w:sz w:val="32"/>
+          <w:szCs w:val="32"/>
+        </w:rPr>
+        <w:t xml:space="preserve"> VERY IMPORTANT, the variable (</w:t>
+      </w:r>
+      <w:proofErr w:type="spellStart"/>
+      <w:r>
+        <w:rPr>
+          <w:b/>
+          <w:bCs/>
+          <w:sz w:val="32"/>
+          <w:szCs w:val="32"/>
+        </w:rPr>
+        <w:t>apiUrl</w:t>
+      </w:r>
+      <w:proofErr w:type="spellEnd"/>
+      <w:r>
+        <w:rPr>
+          <w:sz w:val="32"/>
+          <w:szCs w:val="32"/>
+        </w:rPr>
+        <w:t xml:space="preserve">) to which Environment value will be assigned </w:t>
+      </w:r>
+      <w:r>
+        <w:rPr>
+          <w:sz w:val="32"/>
+          <w:szCs w:val="32"/>
+        </w:rPr>
+        <w:t>must</w:t>
+      </w:r>
+      <w:r>
+        <w:rPr>
+          <w:sz w:val="32"/>
+          <w:szCs w:val="32"/>
+        </w:rPr>
+        <w:t xml:space="preserve"> be </w:t>
+      </w:r>
+      <w:r>
+        <w:rPr>
+          <w:b/>
+          <w:bCs/>
+          <w:sz w:val="32"/>
+          <w:szCs w:val="32"/>
+        </w:rPr>
+        <w:t>const</w:t>
+      </w:r>
+      <w:r>
+        <w:rPr>
+          <w:sz w:val="32"/>
+          <w:szCs w:val="32"/>
+        </w:rPr>
+        <w:t xml:space="preserve"> (compile-time assignment). If its</w:t>
+      </w:r>
+      <w:r>
+        <w:rPr>
+          <w:b/>
+          <w:bCs/>
+          <w:sz w:val="32"/>
+          <w:szCs w:val="32"/>
+        </w:rPr>
+        <w:t xml:space="preserve"> final</w:t>
+      </w:r>
+      <w:r>
+        <w:rPr>
+          <w:sz w:val="32"/>
+          <w:szCs w:val="32"/>
+        </w:rPr>
+        <w:t xml:space="preserve"> (run-time assignment, but there’s no Environment value in runtime) the value won’t show up and </w:t>
+      </w:r>
+      <w:proofErr w:type="spellStart"/>
+      <w:r>
+        <w:rPr>
+          <w:b/>
+          <w:bCs/>
+          <w:sz w:val="32"/>
+          <w:szCs w:val="32"/>
+        </w:rPr>
+        <w:t>String.fromEnvironment</w:t>
+      </w:r>
+      <w:proofErr w:type="spellEnd"/>
+      <w:r>
+        <w:rPr>
+          <w:b/>
+          <w:bCs/>
+          <w:sz w:val="32"/>
+          <w:szCs w:val="32"/>
+        </w:rPr>
+        <w:t>()</w:t>
+      </w:r>
+      <w:r>
+        <w:rPr>
+          <w:b/>
+          <w:bCs/>
+          <w:sz w:val="32"/>
+          <w:szCs w:val="32"/>
+        </w:rPr>
+        <w:t xml:space="preserve"> </w:t>
+      </w:r>
+      <w:r>
+        <w:rPr>
+          <w:sz w:val="32"/>
+          <w:szCs w:val="32"/>
+        </w:rPr>
+        <w:t xml:space="preserve">will return empty </w:t>
+      </w:r>
+      <w:r>
+        <w:rPr>
+          <w:b/>
+          <w:bCs/>
+          <w:sz w:val="32"/>
+          <w:szCs w:val="32"/>
+        </w:rPr>
+        <w:t>String</w:t>
+      </w:r>
+    </w:p>
+    <w:p>
+      <w:pPr>
+        <w:jc w:val="both"/>
+        <w:rPr>
+          <w:sz w:val="32"/>
+          <w:szCs w:val="32"/>
+        </w:rPr>
+      </w:pPr>
+    </w:p>
+    <w:p>
+      <w:pPr>
+        <w:jc w:val="both"/>
+        <w:rPr>
+          <w:sz w:val="32"/>
+          <w:szCs w:val="32"/>
+        </w:rPr>
+      </w:pPr>
     </w:p>
     <w:p>
       <w:pPr>
@@ -10883,7 +11044,6 @@
           <w:sz w:val="32"/>
           <w:szCs w:val="32"/>
         </w:rPr>
-        <w:lastRenderedPageBreak/>
         <w:t>Firebase Admin credentials</w:t>
       </w:r>
     </w:p>
@@ -11298,6 +11458,7 @@
           <w:sz w:val="32"/>
           <w:szCs w:val="32"/>
         </w:rPr>
+        <w:lastRenderedPageBreak/>
         <w:t>{</w:t>
       </w:r>
     </w:p>
@@ -11506,7 +11667,6 @@
           <w:sz w:val="32"/>
           <w:szCs w:val="32"/>
         </w:rPr>
-        <w:lastRenderedPageBreak/>
         <w:t>--dart-define-from-file=env/</w:t>
       </w:r>
       <w:proofErr w:type="spellStart"/>
@@ -11894,6 +12054,7 @@
           <w:sz w:val="32"/>
           <w:szCs w:val="32"/>
         </w:rPr>
+        <w:lastRenderedPageBreak/>
         <w:t xml:space="preserve"># </w:t>
       </w:r>
       <w:r>
@@ -12067,7 +12228,57 @@
           <w:sz w:val="32"/>
           <w:szCs w:val="32"/>
         </w:rPr>
-        <w:t># And access via:</w:t>
+        <w:t># And access via</w:t>
+      </w:r>
+      <w:r>
+        <w:rPr>
+          <w:sz w:val="32"/>
+          <w:szCs w:val="32"/>
+        </w:rPr>
+        <w:t xml:space="preserve"> </w:t>
+      </w:r>
+      <w:proofErr w:type="spellStart"/>
+      <w:r>
+        <w:rPr>
+          <w:b/>
+          <w:bCs/>
+          <w:sz w:val="32"/>
+          <w:szCs w:val="32"/>
+        </w:rPr>
+        <w:t>String.fromEnvironment</w:t>
+      </w:r>
+      <w:proofErr w:type="spellEnd"/>
+      <w:r>
+        <w:rPr>
+          <w:b/>
+          <w:bCs/>
+          <w:sz w:val="32"/>
+          <w:szCs w:val="32"/>
+        </w:rPr>
+        <w:t>()</w:t>
+      </w:r>
+      <w:r>
+        <w:rPr>
+          <w:b/>
+          <w:bCs/>
+          <w:sz w:val="32"/>
+          <w:szCs w:val="32"/>
+        </w:rPr>
+        <w:t xml:space="preserve"> </w:t>
+      </w:r>
+      <w:r>
+        <w:rPr>
+          <w:sz w:val="32"/>
+          <w:szCs w:val="32"/>
+        </w:rPr>
+        <w:t>method</w:t>
+      </w:r>
+      <w:r>
+        <w:rPr>
+          <w:sz w:val="32"/>
+          <w:szCs w:val="32"/>
+        </w:rPr>
+        <w:t>:</w:t>
       </w:r>
     </w:p>
     <w:p>
@@ -12133,7 +12344,6 @@
           <w:sz w:val="32"/>
           <w:szCs w:val="32"/>
         </w:rPr>
-        <w:lastRenderedPageBreak/>
         <w:t xml:space="preserve">  static const </w:t>
       </w:r>
       <w:proofErr w:type="spellStart"/>
@@ -12321,6 +12531,131 @@
           <w:szCs w:val="32"/>
         </w:rPr>
       </w:pPr>
+      <w:r>
+        <w:rPr>
+          <w:b/>
+          <w:bCs/>
+          <w:sz w:val="32"/>
+          <w:szCs w:val="32"/>
+        </w:rPr>
+        <w:t>NOTE:</w:t>
+      </w:r>
+      <w:r>
+        <w:rPr>
+          <w:sz w:val="32"/>
+          <w:szCs w:val="32"/>
+        </w:rPr>
+        <w:t xml:space="preserve"> VERY IMPORTANT, the variable (</w:t>
+      </w:r>
+      <w:proofErr w:type="spellStart"/>
+      <w:r>
+        <w:rPr>
+          <w:b/>
+          <w:bCs/>
+          <w:sz w:val="32"/>
+          <w:szCs w:val="32"/>
+        </w:rPr>
+        <w:t>baseUrl</w:t>
+      </w:r>
+      <w:proofErr w:type="spellEnd"/>
+      <w:r>
+        <w:rPr>
+          <w:sz w:val="32"/>
+          <w:szCs w:val="32"/>
+        </w:rPr>
+        <w:t>) to which Environment value</w:t>
+      </w:r>
+      <w:r>
+        <w:rPr>
+          <w:sz w:val="32"/>
+          <w:szCs w:val="32"/>
+        </w:rPr>
+        <w:t xml:space="preserve"> will be assigned, must</w:t>
+      </w:r>
+      <w:r>
+        <w:rPr>
+          <w:sz w:val="32"/>
+          <w:szCs w:val="32"/>
+        </w:rPr>
+        <w:t xml:space="preserve"> be </w:t>
+      </w:r>
+      <w:r>
+        <w:rPr>
+          <w:b/>
+          <w:bCs/>
+          <w:sz w:val="32"/>
+          <w:szCs w:val="32"/>
+        </w:rPr>
+        <w:t>const</w:t>
+      </w:r>
+      <w:r>
+        <w:rPr>
+          <w:sz w:val="32"/>
+          <w:szCs w:val="32"/>
+        </w:rPr>
+        <w:t xml:space="preserve"> (compile-time assignment). If its</w:t>
+      </w:r>
+      <w:r>
+        <w:rPr>
+          <w:b/>
+          <w:bCs/>
+          <w:sz w:val="32"/>
+          <w:szCs w:val="32"/>
+        </w:rPr>
+        <w:t xml:space="preserve"> final</w:t>
+      </w:r>
+      <w:r>
+        <w:rPr>
+          <w:sz w:val="32"/>
+          <w:szCs w:val="32"/>
+        </w:rPr>
+        <w:t xml:space="preserve"> (run-time assignment, but there’s no Environment value in runtime) the value won’t show up and </w:t>
+      </w:r>
+      <w:proofErr w:type="spellStart"/>
+      <w:r>
+        <w:rPr>
+          <w:b/>
+          <w:bCs/>
+          <w:sz w:val="32"/>
+          <w:szCs w:val="32"/>
+        </w:rPr>
+        <w:t>String.fromEnvironment</w:t>
+      </w:r>
+      <w:proofErr w:type="spellEnd"/>
+      <w:r>
+        <w:rPr>
+          <w:b/>
+          <w:bCs/>
+          <w:sz w:val="32"/>
+          <w:szCs w:val="32"/>
+        </w:rPr>
+        <w:t>()</w:t>
+      </w:r>
+      <w:r>
+        <w:rPr>
+          <w:b/>
+          <w:bCs/>
+          <w:sz w:val="32"/>
+          <w:szCs w:val="32"/>
+        </w:rPr>
+        <w:t xml:space="preserve"> </w:t>
+      </w:r>
+      <w:r>
+        <w:rPr>
+          <w:sz w:val="32"/>
+          <w:szCs w:val="32"/>
+        </w:rPr>
+        <w:t xml:space="preserve">will return empty </w:t>
+      </w:r>
+      <w:r>
+        <w:rPr>
+          <w:b/>
+          <w:bCs/>
+          <w:sz w:val="32"/>
+          <w:szCs w:val="32"/>
+        </w:rPr>
+        <w:t>String</w:t>
+      </w:r>
     </w:p>
     <w:p>
       <w:pPr>
@@ -12521,6 +12856,7 @@
                 <w:sz w:val="32"/>
                 <w:szCs w:val="32"/>
               </w:rPr>
+              <w:lastRenderedPageBreak/>
               <w:t>flutter_dotenv</w:t>
             </w:r>
             <w:proofErr w:type="spellEnd"/>
@@ -12903,195 +13239,195 @@
           <w:sz w:val="28"/>
           <w:szCs w:val="28"/>
         </w:rPr>
+        <w:t>└─ Production Version</w:t>
+      </w:r>
+    </w:p>
+    <w:p>
+      <w:pPr>
+        <w:jc w:val="both"/>
+        <w:rPr>
+          <w:sz w:val="32"/>
+          <w:szCs w:val="32"/>
+        </w:rPr>
+      </w:pPr>
+    </w:p>
+    <w:p>
+      <w:pPr>
+        <w:jc w:val="both"/>
+        <w:rPr>
+          <w:sz w:val="32"/>
+          <w:szCs w:val="32"/>
+        </w:rPr>
+      </w:pPr>
+      <w:r>
+        <w:rPr>
+          <w:sz w:val="32"/>
+          <w:szCs w:val="32"/>
+        </w:rPr>
+        <w:t>Importance of Flavor:</w:t>
+      </w:r>
+    </w:p>
+    <w:p>
+      <w:pPr>
+        <w:jc w:val="both"/>
+        <w:rPr>
+          <w:sz w:val="32"/>
+          <w:szCs w:val="32"/>
+        </w:rPr>
+      </w:pPr>
+      <w:r>
+        <w:rPr>
+          <w:sz w:val="32"/>
+          <w:szCs w:val="32"/>
+        </w:rPr>
+        <w:t># Suppose we have a food delivery app where Dev uses this to talk to DEV API:</w:t>
+      </w:r>
+    </w:p>
+    <w:p>
+      <w:pPr>
+        <w:jc w:val="both"/>
+        <w:rPr>
+          <w:b/>
+          <w:bCs/>
+          <w:sz w:val="32"/>
+          <w:szCs w:val="32"/>
+        </w:rPr>
+      </w:pPr>
+      <w:r>
+        <w:rPr>
+          <w:b/>
+          <w:bCs/>
+          <w:sz w:val="32"/>
+          <w:szCs w:val="32"/>
+        </w:rPr>
+        <w:t>https://dev-api.myapp.com</w:t>
+      </w:r>
+    </w:p>
+    <w:p>
+      <w:pPr>
+        <w:jc w:val="both"/>
+        <w:rPr>
+          <w:sz w:val="32"/>
+          <w:szCs w:val="32"/>
+        </w:rPr>
+      </w:pPr>
+      <w:r>
+        <w:rPr>
+          <w:sz w:val="32"/>
+          <w:szCs w:val="32"/>
+        </w:rPr>
+        <w:t># Staging uses this to talk to Staging API:</w:t>
+      </w:r>
+    </w:p>
+    <w:p>
+      <w:pPr>
+        <w:jc w:val="both"/>
+        <w:rPr>
+          <w:b/>
+          <w:bCs/>
+          <w:sz w:val="32"/>
+          <w:szCs w:val="32"/>
+        </w:rPr>
+      </w:pPr>
+      <w:r>
+        <w:rPr>
+          <w:b/>
+          <w:bCs/>
+          <w:sz w:val="32"/>
+          <w:szCs w:val="32"/>
+        </w:rPr>
+        <w:t>https://staging-api.myapp.com</w:t>
+      </w:r>
+    </w:p>
+    <w:p>
+      <w:pPr>
+        <w:jc w:val="both"/>
+        <w:rPr>
+          <w:sz w:val="32"/>
+          <w:szCs w:val="32"/>
+        </w:rPr>
+      </w:pPr>
+      <w:r>
+        <w:rPr>
+          <w:sz w:val="32"/>
+          <w:szCs w:val="32"/>
+        </w:rPr>
+        <w:t># Production uses this to talk to Production API:</w:t>
+      </w:r>
+    </w:p>
+    <w:p>
+      <w:pPr>
+        <w:jc w:val="both"/>
+        <w:rPr>
+          <w:b/>
+          <w:bCs/>
+          <w:sz w:val="32"/>
+          <w:szCs w:val="32"/>
+        </w:rPr>
+      </w:pPr>
+      <w:r>
+        <w:rPr>
+          <w:b/>
+          <w:bCs/>
+          <w:sz w:val="32"/>
+          <w:szCs w:val="32"/>
+        </w:rPr>
+        <w:t>https://api.myapp.com</w:t>
+      </w:r>
+    </w:p>
+    <w:p>
+      <w:pPr>
+        <w:jc w:val="both"/>
+        <w:rPr>
+          <w:sz w:val="32"/>
+          <w:szCs w:val="32"/>
+        </w:rPr>
+      </w:pPr>
+      <w:r>
+        <w:rPr>
+          <w:sz w:val="32"/>
+          <w:szCs w:val="32"/>
+        </w:rPr>
+        <w:t xml:space="preserve"># Without Flavors </w:t>
+      </w:r>
+      <w:proofErr w:type="spellStart"/>
+      <w:r>
+        <w:rPr>
+          <w:b/>
+          <w:bCs/>
+          <w:sz w:val="32"/>
+          <w:szCs w:val="32"/>
+        </w:rPr>
+        <w:t>baseUrl</w:t>
+      </w:r>
+      <w:proofErr w:type="spellEnd"/>
+      <w:r>
+        <w:rPr>
+          <w:sz w:val="32"/>
+          <w:szCs w:val="32"/>
+        </w:rPr>
+        <w:t xml:space="preserve"> needs to be changed manually (dangerous):</w:t>
+      </w:r>
+    </w:p>
+    <w:p>
+      <w:pPr>
+        <w:jc w:val="both"/>
+        <w:rPr>
+          <w:b/>
+          <w:bCs/>
+          <w:sz w:val="32"/>
+          <w:szCs w:val="32"/>
+        </w:rPr>
+      </w:pPr>
+      <w:r>
+        <w:rPr>
+          <w:b/>
+          <w:bCs/>
+          <w:color w:val="D86DCB" w:themeColor="accent5" w:themeTint="99"/>
+          <w:sz w:val="32"/>
+          <w:szCs w:val="32"/>
+        </w:rPr>
         <w:lastRenderedPageBreak/>
-        <w:t>└─ Production Version</w:t>
-      </w:r>
-    </w:p>
-    <w:p>
-      <w:pPr>
-        <w:jc w:val="both"/>
-        <w:rPr>
-          <w:sz w:val="32"/>
-          <w:szCs w:val="32"/>
-        </w:rPr>
-      </w:pPr>
-    </w:p>
-    <w:p>
-      <w:pPr>
-        <w:jc w:val="both"/>
-        <w:rPr>
-          <w:sz w:val="32"/>
-          <w:szCs w:val="32"/>
-        </w:rPr>
-      </w:pPr>
-      <w:r>
-        <w:rPr>
-          <w:sz w:val="32"/>
-          <w:szCs w:val="32"/>
-        </w:rPr>
-        <w:t>Importance of Flavor:</w:t>
-      </w:r>
-    </w:p>
-    <w:p>
-      <w:pPr>
-        <w:jc w:val="both"/>
-        <w:rPr>
-          <w:sz w:val="32"/>
-          <w:szCs w:val="32"/>
-        </w:rPr>
-      </w:pPr>
-      <w:r>
-        <w:rPr>
-          <w:sz w:val="32"/>
-          <w:szCs w:val="32"/>
-        </w:rPr>
-        <w:t># Suppose we have a food delivery app where Dev uses this to talk to DEV API:</w:t>
-      </w:r>
-    </w:p>
-    <w:p>
-      <w:pPr>
-        <w:jc w:val="both"/>
-        <w:rPr>
-          <w:b/>
-          <w:bCs/>
-          <w:sz w:val="32"/>
-          <w:szCs w:val="32"/>
-        </w:rPr>
-      </w:pPr>
-      <w:r>
-        <w:rPr>
-          <w:b/>
-          <w:bCs/>
-          <w:sz w:val="32"/>
-          <w:szCs w:val="32"/>
-        </w:rPr>
-        <w:t>https://dev-api.myapp.com</w:t>
-      </w:r>
-    </w:p>
-    <w:p>
-      <w:pPr>
-        <w:jc w:val="both"/>
-        <w:rPr>
-          <w:sz w:val="32"/>
-          <w:szCs w:val="32"/>
-        </w:rPr>
-      </w:pPr>
-      <w:r>
-        <w:rPr>
-          <w:sz w:val="32"/>
-          <w:szCs w:val="32"/>
-        </w:rPr>
-        <w:t># Staging uses this to talk to Staging API:</w:t>
-      </w:r>
-    </w:p>
-    <w:p>
-      <w:pPr>
-        <w:jc w:val="both"/>
-        <w:rPr>
-          <w:b/>
-          <w:bCs/>
-          <w:sz w:val="32"/>
-          <w:szCs w:val="32"/>
-        </w:rPr>
-      </w:pPr>
-      <w:r>
-        <w:rPr>
-          <w:b/>
-          <w:bCs/>
-          <w:sz w:val="32"/>
-          <w:szCs w:val="32"/>
-        </w:rPr>
-        <w:t>https://staging-api.myapp.com</w:t>
-      </w:r>
-    </w:p>
-    <w:p>
-      <w:pPr>
-        <w:jc w:val="both"/>
-        <w:rPr>
-          <w:sz w:val="32"/>
-          <w:szCs w:val="32"/>
-        </w:rPr>
-      </w:pPr>
-      <w:r>
-        <w:rPr>
-          <w:sz w:val="32"/>
-          <w:szCs w:val="32"/>
-        </w:rPr>
-        <w:t># Production uses this to talk to Production API:</w:t>
-      </w:r>
-    </w:p>
-    <w:p>
-      <w:pPr>
-        <w:jc w:val="both"/>
-        <w:rPr>
-          <w:b/>
-          <w:bCs/>
-          <w:sz w:val="32"/>
-          <w:szCs w:val="32"/>
-        </w:rPr>
-      </w:pPr>
-      <w:r>
-        <w:rPr>
-          <w:b/>
-          <w:bCs/>
-          <w:sz w:val="32"/>
-          <w:szCs w:val="32"/>
-        </w:rPr>
-        <w:t>https://api.myapp.com</w:t>
-      </w:r>
-    </w:p>
-    <w:p>
-      <w:pPr>
-        <w:jc w:val="both"/>
-        <w:rPr>
-          <w:sz w:val="32"/>
-          <w:szCs w:val="32"/>
-        </w:rPr>
-      </w:pPr>
-      <w:r>
-        <w:rPr>
-          <w:sz w:val="32"/>
-          <w:szCs w:val="32"/>
-        </w:rPr>
-        <w:t xml:space="preserve"># Without Flavors </w:t>
-      </w:r>
-      <w:proofErr w:type="spellStart"/>
-      <w:r>
-        <w:rPr>
-          <w:b/>
-          <w:bCs/>
-          <w:sz w:val="32"/>
-          <w:szCs w:val="32"/>
-        </w:rPr>
-        <w:t>baseUrl</w:t>
-      </w:r>
-      <w:proofErr w:type="spellEnd"/>
-      <w:r>
-        <w:rPr>
-          <w:sz w:val="32"/>
-          <w:szCs w:val="32"/>
-        </w:rPr>
-        <w:t xml:space="preserve"> needs to be changed manually (dangerous):</w:t>
-      </w:r>
-    </w:p>
-    <w:p>
-      <w:pPr>
-        <w:jc w:val="both"/>
-        <w:rPr>
-          <w:b/>
-          <w:bCs/>
-          <w:sz w:val="32"/>
-          <w:szCs w:val="32"/>
-        </w:rPr>
-      </w:pPr>
-      <w:r>
-        <w:rPr>
-          <w:b/>
-          <w:bCs/>
-          <w:color w:val="D86DCB" w:themeColor="accent5" w:themeTint="99"/>
-          <w:sz w:val="32"/>
-          <w:szCs w:val="32"/>
-        </w:rPr>
         <w:t xml:space="preserve">const </w:t>
       </w:r>
       <w:proofErr w:type="spellStart"/>
@@ -13401,321 +13737,321 @@
           <w:sz w:val="32"/>
           <w:szCs w:val="32"/>
         </w:rPr>
+        <w:t xml:space="preserve">  --flavor prod \</w:t>
+      </w:r>
+    </w:p>
+    <w:p>
+      <w:pPr>
+        <w:jc w:val="both"/>
+        <w:rPr>
+          <w:b/>
+          <w:bCs/>
+          <w:color w:val="60CAF3" w:themeColor="accent4" w:themeTint="99"/>
+          <w:sz w:val="32"/>
+          <w:szCs w:val="32"/>
+        </w:rPr>
+      </w:pPr>
+      <w:r>
+        <w:rPr>
+          <w:b/>
+          <w:bCs/>
+          <w:color w:val="60CAF3" w:themeColor="accent4" w:themeTint="99"/>
+          <w:sz w:val="32"/>
+          <w:szCs w:val="32"/>
+        </w:rPr>
+        <w:t xml:space="preserve">  --dart-define-from-file=env/</w:t>
+      </w:r>
+      <w:proofErr w:type="spellStart"/>
+      <w:r>
+        <w:rPr>
+          <w:b/>
+          <w:bCs/>
+          <w:color w:val="60CAF3" w:themeColor="accent4" w:themeTint="99"/>
+          <w:sz w:val="32"/>
+          <w:szCs w:val="32"/>
+        </w:rPr>
+        <w:t>prod.json</w:t>
+      </w:r>
+      <w:proofErr w:type="spellEnd"/>
+    </w:p>
+    <w:p>
+      <w:pPr>
+        <w:jc w:val="both"/>
+        <w:rPr>
+          <w:sz w:val="32"/>
+          <w:szCs w:val="32"/>
+        </w:rPr>
+      </w:pPr>
+      <w:r>
+        <w:rPr>
+          <w:sz w:val="32"/>
+          <w:szCs w:val="32"/>
+        </w:rPr>
+        <w:t># Mental Model</w:t>
+      </w:r>
+    </w:p>
+    <w:p>
+      <w:pPr>
+        <w:jc w:val="both"/>
+        <w:rPr>
+          <w:sz w:val="32"/>
+          <w:szCs w:val="32"/>
+        </w:rPr>
+      </w:pPr>
+      <w:r>
+        <w:rPr>
+          <w:sz w:val="32"/>
+          <w:szCs w:val="32"/>
+        </w:rPr>
+        <w:t>Flavor</w:t>
+      </w:r>
+      <w:r>
+        <w:rPr>
+          <w:sz w:val="32"/>
+          <w:szCs w:val="32"/>
+        </w:rPr>
+        <w:t xml:space="preserve"> </w:t>
+      </w:r>
+      <w:r>
+        <w:rPr>
+          <w:sz w:val="32"/>
+          <w:szCs w:val="32"/>
+        </w:rPr>
+        <w:t>=</w:t>
+      </w:r>
+      <w:r>
+        <w:rPr>
+          <w:sz w:val="32"/>
+          <w:szCs w:val="32"/>
+        </w:rPr>
+        <w:t xml:space="preserve"> </w:t>
+      </w:r>
+      <w:r>
+        <w:rPr>
+          <w:sz w:val="32"/>
+          <w:szCs w:val="32"/>
+        </w:rPr>
+        <w:t>Which app am I building?</w:t>
+      </w:r>
+    </w:p>
+    <w:p>
+      <w:pPr>
+        <w:jc w:val="both"/>
+        <w:rPr>
+          <w:sz w:val="32"/>
+          <w:szCs w:val="32"/>
+        </w:rPr>
+      </w:pPr>
+      <w:r>
+        <w:rPr>
+          <w:sz w:val="32"/>
+          <w:szCs w:val="32"/>
+        </w:rPr>
+        <w:t>dart-define</w:t>
+      </w:r>
+      <w:r>
+        <w:rPr>
+          <w:sz w:val="32"/>
+          <w:szCs w:val="32"/>
+        </w:rPr>
+        <w:t xml:space="preserve"> </w:t>
+      </w:r>
+      <w:r>
+        <w:rPr>
+          <w:sz w:val="32"/>
+          <w:szCs w:val="32"/>
+        </w:rPr>
+        <w:t>=</w:t>
+      </w:r>
+      <w:r>
+        <w:rPr>
+          <w:sz w:val="32"/>
+          <w:szCs w:val="32"/>
+        </w:rPr>
+        <w:t xml:space="preserve"> </w:t>
+      </w:r>
+      <w:r>
+        <w:rPr>
+          <w:sz w:val="32"/>
+          <w:szCs w:val="32"/>
+        </w:rPr>
+        <w:t>What configuration values should it use?</w:t>
+      </w:r>
+    </w:p>
+    <w:p>
+      <w:pPr>
+        <w:jc w:val="both"/>
+        <w:rPr>
+          <w:sz w:val="32"/>
+          <w:szCs w:val="32"/>
+        </w:rPr>
+      </w:pPr>
+      <w:r>
+        <w:rPr>
+          <w:sz w:val="32"/>
+          <w:szCs w:val="32"/>
+        </w:rPr>
+        <w:t># Example, for running Dev Flavor</w:t>
+      </w:r>
+    </w:p>
+    <w:p>
+      <w:pPr>
+        <w:jc w:val="both"/>
+        <w:rPr>
+          <w:b/>
+          <w:bCs/>
+          <w:color w:val="60CAF3" w:themeColor="accent4" w:themeTint="99"/>
+          <w:sz w:val="32"/>
+          <w:szCs w:val="32"/>
+        </w:rPr>
+      </w:pPr>
+      <w:r>
+        <w:rPr>
+          <w:b/>
+          <w:bCs/>
+          <w:color w:val="60CAF3" w:themeColor="accent4" w:themeTint="99"/>
+          <w:sz w:val="32"/>
+          <w:szCs w:val="32"/>
+        </w:rPr>
+        <w:t>flutter run \</w:t>
+      </w:r>
+    </w:p>
+    <w:p>
+      <w:pPr>
+        <w:jc w:val="both"/>
+        <w:rPr>
+          <w:b/>
+          <w:bCs/>
+          <w:color w:val="60CAF3" w:themeColor="accent4" w:themeTint="99"/>
+          <w:sz w:val="32"/>
+          <w:szCs w:val="32"/>
+        </w:rPr>
+      </w:pPr>
+      <w:r>
+        <w:rPr>
+          <w:b/>
+          <w:bCs/>
+          <w:color w:val="60CAF3" w:themeColor="accent4" w:themeTint="99"/>
+          <w:sz w:val="32"/>
+          <w:szCs w:val="32"/>
+        </w:rPr>
+        <w:t>--flavor dev \</w:t>
+      </w:r>
+    </w:p>
+    <w:p>
+      <w:pPr>
+        <w:jc w:val="both"/>
+        <w:rPr>
+          <w:b/>
+          <w:bCs/>
+          <w:color w:val="60CAF3" w:themeColor="accent4" w:themeTint="99"/>
+          <w:sz w:val="32"/>
+          <w:szCs w:val="32"/>
+        </w:rPr>
+      </w:pPr>
+      <w:r>
+        <w:rPr>
+          <w:b/>
+          <w:bCs/>
+          <w:color w:val="60CAF3" w:themeColor="accent4" w:themeTint="99"/>
+          <w:sz w:val="32"/>
+          <w:szCs w:val="32"/>
+        </w:rPr>
+        <w:t>--dart-define-from-file=env/</w:t>
+      </w:r>
+      <w:proofErr w:type="spellStart"/>
+      <w:r>
+        <w:rPr>
+          <w:b/>
+          <w:bCs/>
+          <w:color w:val="60CAF3" w:themeColor="accent4" w:themeTint="99"/>
+          <w:sz w:val="32"/>
+          <w:szCs w:val="32"/>
+        </w:rPr>
+        <w:t>dev.json</w:t>
+      </w:r>
+      <w:proofErr w:type="spellEnd"/>
+    </w:p>
+    <w:p>
+      <w:pPr>
+        <w:jc w:val="both"/>
+        <w:rPr>
+          <w:sz w:val="32"/>
+          <w:szCs w:val="32"/>
+        </w:rPr>
+      </w:pPr>
+      <w:r>
+        <w:rPr>
+          <w:sz w:val="32"/>
+          <w:szCs w:val="32"/>
+        </w:rPr>
+        <w:t># For Production Flavor (same code, but different behavior)</w:t>
+      </w:r>
+    </w:p>
+    <w:p>
+      <w:pPr>
+        <w:jc w:val="both"/>
+        <w:rPr>
+          <w:b/>
+          <w:bCs/>
+          <w:color w:val="60CAF3" w:themeColor="accent4" w:themeTint="99"/>
+          <w:sz w:val="32"/>
+          <w:szCs w:val="32"/>
+        </w:rPr>
+      </w:pPr>
+      <w:r>
+        <w:rPr>
+          <w:b/>
+          <w:bCs/>
+          <w:color w:val="60CAF3" w:themeColor="accent4" w:themeTint="99"/>
+          <w:sz w:val="32"/>
+          <w:szCs w:val="32"/>
+        </w:rPr>
+        <w:t>flutter run \</w:t>
+      </w:r>
+    </w:p>
+    <w:p>
+      <w:pPr>
+        <w:jc w:val="both"/>
+        <w:rPr>
+          <w:b/>
+          <w:bCs/>
+          <w:color w:val="60CAF3" w:themeColor="accent4" w:themeTint="99"/>
+          <w:sz w:val="32"/>
+          <w:szCs w:val="32"/>
+        </w:rPr>
+      </w:pPr>
+      <w:r>
+        <w:rPr>
+          <w:b/>
+          <w:bCs/>
+          <w:color w:val="60CAF3" w:themeColor="accent4" w:themeTint="99"/>
+          <w:sz w:val="32"/>
+          <w:szCs w:val="32"/>
+        </w:rPr>
+        <w:t>--flavor prod \</w:t>
+      </w:r>
+    </w:p>
+    <w:p>
+      <w:pPr>
+        <w:jc w:val="both"/>
+        <w:rPr>
+          <w:b/>
+          <w:bCs/>
+          <w:color w:val="60CAF3" w:themeColor="accent4" w:themeTint="99"/>
+          <w:sz w:val="32"/>
+          <w:szCs w:val="32"/>
+        </w:rPr>
+      </w:pPr>
+      <w:r>
+        <w:rPr>
+          <w:b/>
+          <w:bCs/>
+          <w:color w:val="60CAF3" w:themeColor="accent4" w:themeTint="99"/>
+          <w:sz w:val="32"/>
+          <w:szCs w:val="32"/>
+        </w:rPr>
         <w:lastRenderedPageBreak/>
-        <w:t xml:space="preserve">  --flavor prod \</w:t>
-      </w:r>
-    </w:p>
-    <w:p>
-      <w:pPr>
-        <w:jc w:val="both"/>
-        <w:rPr>
-          <w:b/>
-          <w:bCs/>
-          <w:color w:val="60CAF3" w:themeColor="accent4" w:themeTint="99"/>
-          <w:sz w:val="32"/>
-          <w:szCs w:val="32"/>
-        </w:rPr>
-      </w:pPr>
-      <w:r>
-        <w:rPr>
-          <w:b/>
-          <w:bCs/>
-          <w:color w:val="60CAF3" w:themeColor="accent4" w:themeTint="99"/>
-          <w:sz w:val="32"/>
-          <w:szCs w:val="32"/>
-        </w:rPr>
-        <w:t xml:space="preserve">  --dart-define-from-file=env/</w:t>
-      </w:r>
-      <w:proofErr w:type="spellStart"/>
-      <w:r>
-        <w:rPr>
-          <w:b/>
-          <w:bCs/>
-          <w:color w:val="60CAF3" w:themeColor="accent4" w:themeTint="99"/>
-          <w:sz w:val="32"/>
-          <w:szCs w:val="32"/>
-        </w:rPr>
-        <w:t>prod.json</w:t>
-      </w:r>
-      <w:proofErr w:type="spellEnd"/>
-    </w:p>
-    <w:p>
-      <w:pPr>
-        <w:jc w:val="both"/>
-        <w:rPr>
-          <w:sz w:val="32"/>
-          <w:szCs w:val="32"/>
-        </w:rPr>
-      </w:pPr>
-      <w:r>
-        <w:rPr>
-          <w:sz w:val="32"/>
-          <w:szCs w:val="32"/>
-        </w:rPr>
-        <w:t># Mental Model</w:t>
-      </w:r>
-    </w:p>
-    <w:p>
-      <w:pPr>
-        <w:jc w:val="both"/>
-        <w:rPr>
-          <w:sz w:val="32"/>
-          <w:szCs w:val="32"/>
-        </w:rPr>
-      </w:pPr>
-      <w:r>
-        <w:rPr>
-          <w:sz w:val="32"/>
-          <w:szCs w:val="32"/>
-        </w:rPr>
-        <w:t>Flavor</w:t>
-      </w:r>
-      <w:r>
-        <w:rPr>
-          <w:sz w:val="32"/>
-          <w:szCs w:val="32"/>
-        </w:rPr>
-        <w:t xml:space="preserve"> </w:t>
-      </w:r>
-      <w:r>
-        <w:rPr>
-          <w:sz w:val="32"/>
-          <w:szCs w:val="32"/>
-        </w:rPr>
-        <w:t>=</w:t>
-      </w:r>
-      <w:r>
-        <w:rPr>
-          <w:sz w:val="32"/>
-          <w:szCs w:val="32"/>
-        </w:rPr>
-        <w:t xml:space="preserve"> </w:t>
-      </w:r>
-      <w:r>
-        <w:rPr>
-          <w:sz w:val="32"/>
-          <w:szCs w:val="32"/>
-        </w:rPr>
-        <w:t>Which app am I building?</w:t>
-      </w:r>
-    </w:p>
-    <w:p>
-      <w:pPr>
-        <w:jc w:val="both"/>
-        <w:rPr>
-          <w:sz w:val="32"/>
-          <w:szCs w:val="32"/>
-        </w:rPr>
-      </w:pPr>
-      <w:r>
-        <w:rPr>
-          <w:sz w:val="32"/>
-          <w:szCs w:val="32"/>
-        </w:rPr>
-        <w:t>dart-define</w:t>
-      </w:r>
-      <w:r>
-        <w:rPr>
-          <w:sz w:val="32"/>
-          <w:szCs w:val="32"/>
-        </w:rPr>
-        <w:t xml:space="preserve"> </w:t>
-      </w:r>
-      <w:r>
-        <w:rPr>
-          <w:sz w:val="32"/>
-          <w:szCs w:val="32"/>
-        </w:rPr>
-        <w:t>=</w:t>
-      </w:r>
-      <w:r>
-        <w:rPr>
-          <w:sz w:val="32"/>
-          <w:szCs w:val="32"/>
-        </w:rPr>
-        <w:t xml:space="preserve"> </w:t>
-      </w:r>
-      <w:r>
-        <w:rPr>
-          <w:sz w:val="32"/>
-          <w:szCs w:val="32"/>
-        </w:rPr>
-        <w:t>What configuration values should it use?</w:t>
-      </w:r>
-    </w:p>
-    <w:p>
-      <w:pPr>
-        <w:jc w:val="both"/>
-        <w:rPr>
-          <w:sz w:val="32"/>
-          <w:szCs w:val="32"/>
-        </w:rPr>
-      </w:pPr>
-      <w:r>
-        <w:rPr>
-          <w:sz w:val="32"/>
-          <w:szCs w:val="32"/>
-        </w:rPr>
-        <w:t># Example, for running Dev Flavor</w:t>
-      </w:r>
-    </w:p>
-    <w:p>
-      <w:pPr>
-        <w:jc w:val="both"/>
-        <w:rPr>
-          <w:b/>
-          <w:bCs/>
-          <w:color w:val="60CAF3" w:themeColor="accent4" w:themeTint="99"/>
-          <w:sz w:val="32"/>
-          <w:szCs w:val="32"/>
-        </w:rPr>
-      </w:pPr>
-      <w:r>
-        <w:rPr>
-          <w:b/>
-          <w:bCs/>
-          <w:color w:val="60CAF3" w:themeColor="accent4" w:themeTint="99"/>
-          <w:sz w:val="32"/>
-          <w:szCs w:val="32"/>
-        </w:rPr>
-        <w:t>flutter run \</w:t>
-      </w:r>
-    </w:p>
-    <w:p>
-      <w:pPr>
-        <w:jc w:val="both"/>
-        <w:rPr>
-          <w:b/>
-          <w:bCs/>
-          <w:color w:val="60CAF3" w:themeColor="accent4" w:themeTint="99"/>
-          <w:sz w:val="32"/>
-          <w:szCs w:val="32"/>
-        </w:rPr>
-      </w:pPr>
-      <w:r>
-        <w:rPr>
-          <w:b/>
-          <w:bCs/>
-          <w:color w:val="60CAF3" w:themeColor="accent4" w:themeTint="99"/>
-          <w:sz w:val="32"/>
-          <w:szCs w:val="32"/>
-        </w:rPr>
-        <w:t>--flavor dev \</w:t>
-      </w:r>
-    </w:p>
-    <w:p>
-      <w:pPr>
-        <w:jc w:val="both"/>
-        <w:rPr>
-          <w:b/>
-          <w:bCs/>
-          <w:color w:val="60CAF3" w:themeColor="accent4" w:themeTint="99"/>
-          <w:sz w:val="32"/>
-          <w:szCs w:val="32"/>
-        </w:rPr>
-      </w:pPr>
-      <w:r>
-        <w:rPr>
-          <w:b/>
-          <w:bCs/>
-          <w:color w:val="60CAF3" w:themeColor="accent4" w:themeTint="99"/>
-          <w:sz w:val="32"/>
-          <w:szCs w:val="32"/>
-        </w:rPr>
-        <w:t>--dart-define-from-file=env/</w:t>
-      </w:r>
-      <w:proofErr w:type="spellStart"/>
-      <w:r>
-        <w:rPr>
-          <w:b/>
-          <w:bCs/>
-          <w:color w:val="60CAF3" w:themeColor="accent4" w:themeTint="99"/>
-          <w:sz w:val="32"/>
-          <w:szCs w:val="32"/>
-        </w:rPr>
-        <w:t>dev.json</w:t>
-      </w:r>
-      <w:proofErr w:type="spellEnd"/>
-    </w:p>
-    <w:p>
-      <w:pPr>
-        <w:jc w:val="both"/>
-        <w:rPr>
-          <w:sz w:val="32"/>
-          <w:szCs w:val="32"/>
-        </w:rPr>
-      </w:pPr>
-      <w:r>
-        <w:rPr>
-          <w:sz w:val="32"/>
-          <w:szCs w:val="32"/>
-        </w:rPr>
-        <w:t># For Production Flavor (same code, but different behavior)</w:t>
-      </w:r>
-    </w:p>
-    <w:p>
-      <w:pPr>
-        <w:jc w:val="both"/>
-        <w:rPr>
-          <w:b/>
-          <w:bCs/>
-          <w:color w:val="60CAF3" w:themeColor="accent4" w:themeTint="99"/>
-          <w:sz w:val="32"/>
-          <w:szCs w:val="32"/>
-        </w:rPr>
-      </w:pPr>
-      <w:r>
-        <w:rPr>
-          <w:b/>
-          <w:bCs/>
-          <w:color w:val="60CAF3" w:themeColor="accent4" w:themeTint="99"/>
-          <w:sz w:val="32"/>
-          <w:szCs w:val="32"/>
-        </w:rPr>
-        <w:t>flutter run \</w:t>
-      </w:r>
-    </w:p>
-    <w:p>
-      <w:pPr>
-        <w:jc w:val="both"/>
-        <w:rPr>
-          <w:b/>
-          <w:bCs/>
-          <w:color w:val="60CAF3" w:themeColor="accent4" w:themeTint="99"/>
-          <w:sz w:val="32"/>
-          <w:szCs w:val="32"/>
-        </w:rPr>
-      </w:pPr>
-      <w:r>
-        <w:rPr>
-          <w:b/>
-          <w:bCs/>
-          <w:color w:val="60CAF3" w:themeColor="accent4" w:themeTint="99"/>
-          <w:sz w:val="32"/>
-          <w:szCs w:val="32"/>
-        </w:rPr>
-        <w:t>--flavor prod \</w:t>
-      </w:r>
-    </w:p>
-    <w:p>
-      <w:pPr>
-        <w:jc w:val="both"/>
-        <w:rPr>
-          <w:b/>
-          <w:bCs/>
-          <w:color w:val="60CAF3" w:themeColor="accent4" w:themeTint="99"/>
-          <w:sz w:val="32"/>
-          <w:szCs w:val="32"/>
-        </w:rPr>
-      </w:pPr>
-      <w:r>
-        <w:rPr>
-          <w:b/>
-          <w:bCs/>
-          <w:color w:val="60CAF3" w:themeColor="accent4" w:themeTint="99"/>
-          <w:sz w:val="32"/>
-          <w:szCs w:val="32"/>
-        </w:rPr>
         <w:t>--dart-define-from-file=env/</w:t>
       </w:r>
       <w:proofErr w:type="spellStart"/>

</xml_diff>